<commit_message>
Make v6 documentation build-neutral
</commit_message>
<xml_diff>
--- a/docs/guides/VCL2FMXConverter_v6_0_Navigator_Build024_Application_Inventory.docx
+++ b/docs/guides/VCL2FMXConverter_v6_0_Navigator_Build024_Application_Inventory.docx
@@ -103,7 +103,7 @@
           <w:color w:val="173B65"/>
           <w:sz w:val="28"/>
         </w:rPr>
-        <w:t>Build 024</w:t>
+        <w:t>V6.0</w:t>
       </w:r>
       <w:r>
         <w:rPr>
@@ -225,7 +225,7 @@
         <w:pStyle w:val="Heading1"/>
       </w:pPr>
       <w:r>
-        <w:t>Build 024</w:t>
+        <w:t>V6.0</w:t>
       </w:r>
       <w:r>
         <w:t xml:space="preserve"> at a glance</w:t>
@@ -554,7 +554,7 @@
                 <w:color w:val="FFFFFF"/>
                 <w:sz w:val="18"/>
               </w:rPr>
-              <w:t>Build 024</w:t>
+              <w:t>V6.0</w:t>
             </w:r>
             <w:r>
               <w:rPr>
@@ -1199,7 +1199,7 @@
               <w:rPr>
                 <w:color w:val="173B65"/>
               </w:rPr>
-              <w:t>Build 024</w:t>
+              <w:t>V6.0</w:t>
             </w:r>
             <w:r>
               <w:rPr>
@@ -6947,7 +6947,7 @@
         <w:pStyle w:val="Heading1"/>
       </w:pPr>
       <w:r>
-        <w:t>Build 024</w:t>
+        <w:t>V6.0</w:t>
       </w:r>
       <w:r>
         <w:t xml:space="preserve"> deliverables</w:t>
@@ -7310,7 +7310,7 @@
           <w:color w:val="173B65"/>
           <w:sz w:val="19"/>
         </w:rPr>
-        <w:t>VCL2FMXConverter_v6_0_Navigator_Build024_Source_Distribution_2026-08-03_120124.zip</w:t>
+        <w:t>VCL2FMXConverter_v6_0_Navigator_Source_Distribution_2026-08-03_120124.zip</w:t>
       </w:r>
     </w:p>
     <w:p>
@@ -7667,7 +7667,7 @@
               <w:rPr>
                 <w:sz w:val="18"/>
               </w:rPr>
-              <w:t>Build 024</w:t>
+              <w:t>V6.0</w:t>
             </w:r>
             <w:r>
               <w:rPr>
@@ -7749,7 +7749,7 @@
               <w:rPr>
                 <w:color w:val="173B65"/>
               </w:rPr>
-              <w:t>Build 024</w:t>
+              <w:t>V6.0</w:t>
             </w:r>
             <w:r>
               <w:rPr>
@@ -7935,7 +7935,7 @@
         <w:color w:val="647384"/>
         <w:sz w:val="16"/>
       </w:rPr>
-      <w:t>Build 024</w:t>
+      <w:t>V6.0</w:t>
     </w:r>
   </w:p>
 </w:hdr>

</xml_diff>